<commit_message>
Use business-stage labels throughout lifecycle presentation without changing workflow enforcement
Replit-Task-Id: 104da16b-d044-4076-9d17-5bba2fcede93
Replit-Merge-Attempt: MergeTask:104da16b-d044-4076-9d17-5bba2fcede93:1:81715adf
</commit_message>
<xml_diff>
--- a/deliverables/hro-onboarding-tester-guide.docx
+++ b/deliverables/hro-onboarding-tester-guide.docx
@@ -179,7 +179,7 @@
           <w:b w:val="0"/>
           <w:i w:val="0"/>
         </w:rPr>
-        <w:t>Intake and onboarding gates</w:t>
+        <w:t>Intake and onboarding stages</w:t>
       </w:r>
     </w:p>
     <w:p>
@@ -188,7 +188,7 @@
           <w:b w:val="0"/>
           <w:i w:val="0"/>
         </w:rPr>
-        <w:t>Ordinary authenticated intake uses real case facts and explicit governance grants.</w:t>
+        <w:t>Ordinary authenticated intake uses real case facts and explicit governance grants. The business stages are Offer-Acceptance Package, Background Checks, and Day-1 Readiness.</w:t>
       </w:r>
     </w:p>
     <w:p>
@@ -233,7 +233,7 @@
           <w:b w:val="0"/>
           <w:i w:val="0"/>
         </w:rPr>
-        <w:t>Confirm offer acceptance through its dedicated evidence-backed gate.</w:t>
+        <w:t>Confirm the Offer-Acceptance Package through its dedicated evidence-backed review.</w:t>
       </w:r>
     </w:p>
     <w:p>
@@ -245,7 +245,7 @@
           <w:b w:val="0"/>
           <w:i w:val="0"/>
         </w:rPr>
-        <w:t>Resolve mandatory workstreams before requesting final human readiness review.</w:t>
+        <w:t>Resolve Background Checks and mandatory workstreams before requesting the fresh human Day-1 Readiness review.</w:t>
       </w:r>
     </w:p>
     <w:p>
@@ -2009,7 +2009,7 @@
                 <w:i w:val="0"/>
                 <w:sz w:val="18"/>
               </w:rPr>
-              <w:t>PFC-001 — Control Tower dashboard, gateway and workload visibility</w:t>
+              <w:t>PFC-001 — Control Tower dashboard, stage and workload visibility</w:t>
             </w:r>
           </w:p>
         </w:tc>
@@ -2289,7 +2289,7 @@
                 <w:i w:val="0"/>
                 <w:sz w:val="18"/>
               </w:rPr>
-              <w:t>PFC-006 — Case tasks, checklists and Gateway A/B/C</w:t>
+              <w:t>PFC-006 — Case tasks, checklists and business stages</w:t>
             </w:r>
           </w:p>
         </w:tc>
@@ -5041,7 +5041,7 @@
                 <w:i w:val="0"/>
                 <w:sz w:val="18"/>
               </w:rPr>
-              <w:t>Gateway C state, BGV and approval evidence</w:t>
+              <w:t>Day-1 Readiness state, BGV and approval evidence</w:t>
             </w:r>
             <w:r>
               <w:rPr>
@@ -6119,7 +6119,7 @@
                 <w:i w:val="0"/>
                 <w:sz w:val="18"/>
               </w:rPr>
-              <w:t>Gateway C blocker/approval evidence</w:t>
+              <w:t>Day-1 Readiness blocker/approval evidence</w:t>
             </w:r>
             <w:r>
               <w:rPr>

</xml_diff>